<commit_message>
Unit 10: Home Designer coin game with pair clients
Rebuild the middle of the unit around a coin budget: Mina as a teacher-led
example, Ploy or Noi per pair with a share-with-another-pair step, then each
student designs their own home with 10 coins. Merge the sentence and reason
screens, trim the drills, and update the teacher guide (Bloom's and ADDIE,
client answers, schedule), catalog, and printable worksheet.

Co-Authored-By: Claude Sonnet 5.5 <noreply@anthropic.com>
</commit_message>
<xml_diff>
--- a/_deliverables/EFC-Unit10-My-Perfect-Home-Worksheet.docx
+++ b/_deliverables/EFC-Unit10-My-Perfect-Home-Worksheet.docx
@@ -136,15 +136,15 @@
         </w:tblBorders>
       </w:tblPr>
       <w:tblGrid>
-        <w:gridCol w:w="1950"/>
-        <w:gridCol w:w="3003"/>
+        <w:gridCol w:w="2150"/>
+        <w:gridCol w:w="2803"/>
         <w:gridCol w:w="1950"/>
         <w:gridCol w:w="3003"/>
       </w:tblGrid>
       <w:tr>
         <w:tc>
           <w:tcPr>
-            <w:tcW w:type="dxa" w:w="1950"/>
+            <w:tcW w:type="dxa" w:w="2150"/>
             <w:tcBorders>
               <w:top w:val="none" w:color="FFFFFF" w:sz="0"/>
               <w:left w:val="none" w:color="FFFFFF" w:sz="0"/>
@@ -152,9 +152,9 @@
               <w:right w:val="none" w:color="FFFFFF" w:sz="0"/>
             </w:tcBorders>
             <w:tcMar>
-              <w:top w:type="dxa" w:w="170"/>
+              <w:top w:type="dxa" w:w="140"/>
               <w:left w:type="dxa" w:w="80"/>
-              <w:bottom w:type="dxa" w:w="170"/>
+              <w:bottom w:type="dxa" w:w="140"/>
               <w:right w:type="dxa" w:w="80"/>
             </w:tcMar>
             <w:vAlign w:val="center"/>
@@ -175,7 +175,7 @@
         </w:tc>
         <w:tc>
           <w:tcPr>
-            <w:tcW w:type="dxa" w:w="3003"/>
+            <w:tcW w:type="dxa" w:w="2803"/>
             <w:tcBorders>
               <w:top w:val="none" w:color="FFFFFF" w:sz="0"/>
               <w:left w:val="none" w:color="FFFFFF" w:sz="0"/>
@@ -183,9 +183,9 @@
               <w:right w:val="none" w:color="FFFFFF" w:sz="0"/>
             </w:tcBorders>
             <w:tcMar>
-              <w:top w:type="dxa" w:w="170"/>
+              <w:top w:type="dxa" w:w="140"/>
               <w:left w:type="dxa" w:w="80"/>
-              <w:bottom w:type="dxa" w:w="170"/>
+              <w:bottom w:type="dxa" w:w="140"/>
               <w:right w:type="dxa" w:w="80"/>
             </w:tcMar>
             <w:vAlign w:val="center"/>
@@ -211,9 +211,9 @@
               <w:right w:val="none" w:color="FFFFFF" w:sz="0"/>
             </w:tcBorders>
             <w:tcMar>
-              <w:top w:type="dxa" w:w="170"/>
+              <w:top w:type="dxa" w:w="140"/>
               <w:left w:type="dxa" w:w="80"/>
-              <w:bottom w:type="dxa" w:w="170"/>
+              <w:bottom w:type="dxa" w:w="140"/>
               <w:right w:type="dxa" w:w="80"/>
             </w:tcMar>
             <w:vAlign w:val="center"/>
@@ -242,9 +242,9 @@
               <w:right w:val="none" w:color="FFFFFF" w:sz="0"/>
             </w:tcBorders>
             <w:tcMar>
-              <w:top w:type="dxa" w:w="170"/>
+              <w:top w:type="dxa" w:w="140"/>
               <w:left w:type="dxa" w:w="80"/>
-              <w:bottom w:type="dxa" w:w="170"/>
+              <w:bottom w:type="dxa" w:w="140"/>
               <w:right w:type="dxa" w:w="80"/>
             </w:tcMar>
             <w:vAlign w:val="center"/>
@@ -264,7 +264,7 @@
       <w:tr>
         <w:tc>
           <w:tcPr>
-            <w:tcW w:type="dxa" w:w="1950"/>
+            <w:tcW w:type="dxa" w:w="2150"/>
             <w:tcBorders>
               <w:top w:val="none" w:color="FFFFFF" w:sz="0"/>
               <w:left w:val="none" w:color="FFFFFF" w:sz="0"/>
@@ -272,9 +272,9 @@
               <w:right w:val="none" w:color="FFFFFF" w:sz="0"/>
             </w:tcBorders>
             <w:tcMar>
-              <w:top w:type="dxa" w:w="170"/>
+              <w:top w:type="dxa" w:w="140"/>
               <w:left w:type="dxa" w:w="80"/>
-              <w:bottom w:type="dxa" w:w="170"/>
+              <w:bottom w:type="dxa" w:w="140"/>
               <w:right w:type="dxa" w:w="80"/>
             </w:tcMar>
             <w:vAlign w:val="center"/>
@@ -295,7 +295,7 @@
         </w:tc>
         <w:tc>
           <w:tcPr>
-            <w:tcW w:type="dxa" w:w="3003"/>
+            <w:tcW w:type="dxa" w:w="2803"/>
             <w:tcBorders>
               <w:top w:val="none" w:color="FFFFFF" w:sz="0"/>
               <w:left w:val="none" w:color="FFFFFF" w:sz="0"/>
@@ -303,9 +303,9 @@
               <w:right w:val="none" w:color="FFFFFF" w:sz="0"/>
             </w:tcBorders>
             <w:tcMar>
-              <w:top w:type="dxa" w:w="170"/>
+              <w:top w:type="dxa" w:w="140"/>
               <w:left w:type="dxa" w:w="80"/>
-              <w:bottom w:type="dxa" w:w="170"/>
+              <w:bottom w:type="dxa" w:w="140"/>
               <w:right w:type="dxa" w:w="80"/>
             </w:tcMar>
             <w:vAlign w:val="center"/>
@@ -331,9 +331,9 @@
               <w:right w:val="none" w:color="FFFFFF" w:sz="0"/>
             </w:tcBorders>
             <w:tcMar>
-              <w:top w:type="dxa" w:w="170"/>
+              <w:top w:type="dxa" w:w="140"/>
               <w:left w:type="dxa" w:w="80"/>
-              <w:bottom w:type="dxa" w:w="170"/>
+              <w:bottom w:type="dxa" w:w="140"/>
               <w:right w:type="dxa" w:w="80"/>
             </w:tcMar>
             <w:vAlign w:val="center"/>
@@ -362,9 +362,9 @@
               <w:right w:val="none" w:color="FFFFFF" w:sz="0"/>
             </w:tcBorders>
             <w:tcMar>
-              <w:top w:type="dxa" w:w="170"/>
+              <w:top w:type="dxa" w:w="140"/>
               <w:left w:type="dxa" w:w="80"/>
-              <w:bottom w:type="dxa" w:w="170"/>
+              <w:bottom w:type="dxa" w:w="140"/>
               <w:right w:type="dxa" w:w="80"/>
             </w:tcMar>
             <w:vAlign w:val="center"/>
@@ -384,7 +384,7 @@
       <w:tr>
         <w:tc>
           <w:tcPr>
-            <w:tcW w:type="dxa" w:w="1950"/>
+            <w:tcW w:type="dxa" w:w="2150"/>
             <w:tcBorders>
               <w:top w:val="none" w:color="FFFFFF" w:sz="0"/>
               <w:left w:val="none" w:color="FFFFFF" w:sz="0"/>
@@ -392,9 +392,9 @@
               <w:right w:val="none" w:color="FFFFFF" w:sz="0"/>
             </w:tcBorders>
             <w:tcMar>
-              <w:top w:type="dxa" w:w="170"/>
+              <w:top w:type="dxa" w:w="140"/>
               <w:left w:type="dxa" w:w="80"/>
-              <w:bottom w:type="dxa" w:w="170"/>
+              <w:bottom w:type="dxa" w:w="140"/>
               <w:right w:type="dxa" w:w="80"/>
             </w:tcMar>
             <w:vAlign w:val="center"/>
@@ -415,7 +415,7 @@
         </w:tc>
         <w:tc>
           <w:tcPr>
-            <w:tcW w:type="dxa" w:w="3003"/>
+            <w:tcW w:type="dxa" w:w="2803"/>
             <w:tcBorders>
               <w:top w:val="none" w:color="FFFFFF" w:sz="0"/>
               <w:left w:val="none" w:color="FFFFFF" w:sz="0"/>
@@ -423,9 +423,9 @@
               <w:right w:val="none" w:color="FFFFFF" w:sz="0"/>
             </w:tcBorders>
             <w:tcMar>
-              <w:top w:type="dxa" w:w="170"/>
+              <w:top w:type="dxa" w:w="140"/>
               <w:left w:type="dxa" w:w="80"/>
-              <w:bottom w:type="dxa" w:w="170"/>
+              <w:bottom w:type="dxa" w:w="140"/>
               <w:right w:type="dxa" w:w="80"/>
             </w:tcMar>
             <w:vAlign w:val="center"/>
@@ -451,9 +451,9 @@
               <w:right w:val="none" w:color="FFFFFF" w:sz="0"/>
             </w:tcBorders>
             <w:tcMar>
-              <w:top w:type="dxa" w:w="170"/>
+              <w:top w:type="dxa" w:w="140"/>
               <w:left w:type="dxa" w:w="80"/>
-              <w:bottom w:type="dxa" w:w="170"/>
+              <w:bottom w:type="dxa" w:w="140"/>
               <w:right w:type="dxa" w:w="80"/>
             </w:tcMar>
             <w:vAlign w:val="center"/>
@@ -482,9 +482,9 @@
               <w:right w:val="none" w:color="FFFFFF" w:sz="0"/>
             </w:tcBorders>
             <w:tcMar>
-              <w:top w:type="dxa" w:w="170"/>
+              <w:top w:type="dxa" w:w="140"/>
               <w:left w:type="dxa" w:w="80"/>
-              <w:bottom w:type="dxa" w:w="170"/>
+              <w:bottom w:type="dxa" w:w="140"/>
               <w:right w:type="dxa" w:w="80"/>
             </w:tcMar>
             <w:vAlign w:val="center"/>
@@ -504,7 +504,7 @@
       <w:tr>
         <w:tc>
           <w:tcPr>
-            <w:tcW w:type="dxa" w:w="1950"/>
+            <w:tcW w:type="dxa" w:w="2150"/>
             <w:tcBorders>
               <w:top w:val="none" w:color="FFFFFF" w:sz="0"/>
               <w:left w:val="none" w:color="FFFFFF" w:sz="0"/>
@@ -512,9 +512,9 @@
               <w:right w:val="none" w:color="FFFFFF" w:sz="0"/>
             </w:tcBorders>
             <w:tcMar>
-              <w:top w:type="dxa" w:w="170"/>
+              <w:top w:type="dxa" w:w="140"/>
               <w:left w:type="dxa" w:w="80"/>
-              <w:bottom w:type="dxa" w:w="170"/>
+              <w:bottom w:type="dxa" w:w="140"/>
               <w:right w:type="dxa" w:w="80"/>
             </w:tcMar>
             <w:vAlign w:val="center"/>
@@ -535,7 +535,7 @@
         </w:tc>
         <w:tc>
           <w:tcPr>
-            <w:tcW w:type="dxa" w:w="3003"/>
+            <w:tcW w:type="dxa" w:w="2803"/>
             <w:tcBorders>
               <w:top w:val="none" w:color="FFFFFF" w:sz="0"/>
               <w:left w:val="none" w:color="FFFFFF" w:sz="0"/>
@@ -543,9 +543,9 @@
               <w:right w:val="none" w:color="FFFFFF" w:sz="0"/>
             </w:tcBorders>
             <w:tcMar>
-              <w:top w:type="dxa" w:w="170"/>
+              <w:top w:type="dxa" w:w="140"/>
               <w:left w:type="dxa" w:w="80"/>
-              <w:bottom w:type="dxa" w:w="170"/>
+              <w:bottom w:type="dxa" w:w="140"/>
               <w:right w:type="dxa" w:w="80"/>
             </w:tcMar>
             <w:vAlign w:val="center"/>
@@ -571,9 +571,9 @@
               <w:right w:val="none" w:color="FFFFFF" w:sz="0"/>
             </w:tcBorders>
             <w:tcMar>
-              <w:top w:type="dxa" w:w="170"/>
+              <w:top w:type="dxa" w:w="140"/>
               <w:left w:type="dxa" w:w="80"/>
-              <w:bottom w:type="dxa" w:w="170"/>
+              <w:bottom w:type="dxa" w:w="140"/>
               <w:right w:type="dxa" w:w="80"/>
             </w:tcMar>
             <w:vAlign w:val="center"/>
@@ -602,9 +602,9 @@
               <w:right w:val="none" w:color="FFFFFF" w:sz="0"/>
             </w:tcBorders>
             <w:tcMar>
-              <w:top w:type="dxa" w:w="170"/>
+              <w:top w:type="dxa" w:w="140"/>
               <w:left w:type="dxa" w:w="80"/>
-              <w:bottom w:type="dxa" w:w="170"/>
+              <w:bottom w:type="dxa" w:w="140"/>
               <w:right w:type="dxa" w:w="80"/>
             </w:tcMar>
             <w:vAlign w:val="center"/>
@@ -617,6 +617,126 @@
                 <w:szCs w:val="30"/>
               </w:rPr>
               <w:t xml:space="preserve">yes      no</w:t>
+            </w:r>
+          </w:p>
+        </w:tc>
+      </w:tr>
+      <w:tr>
+        <w:tc>
+          <w:tcPr>
+            <w:tcW w:type="dxa" w:w="2150"/>
+            <w:tcBorders>
+              <w:top w:val="none" w:color="FFFFFF" w:sz="0"/>
+              <w:left w:val="none" w:color="FFFFFF" w:sz="0"/>
+              <w:bottom w:val="single" w:color="C9D1D9" w:sz="4"/>
+              <w:right w:val="none" w:color="FFFFFF" w:sz="0"/>
+            </w:tcBorders>
+            <w:tcMar>
+              <w:top w:type="dxa" w:w="140"/>
+              <w:left w:type="dxa" w:w="80"/>
+              <w:bottom w:type="dxa" w:w="140"/>
+              <w:right w:type="dxa" w:w="80"/>
+            </w:tcMar>
+            <w:vAlign w:val="center"/>
+          </w:tcPr>
+          <w:p>
+            <w:r>
+              <w:rPr>
+                <w:rFonts w:ascii="Arial" w:cs="Arial" w:eastAsia="Arial" w:hAnsi="Arial"/>
+                <w:b/>
+                <w:bCs/>
+                <w:color w:val="163B65"/>
+                <w:sz w:val="30"/>
+                <w:szCs w:val="30"/>
+              </w:rPr>
+              <w:t xml:space="preserve">Near university</w:t>
+            </w:r>
+          </w:p>
+        </w:tc>
+        <w:tc>
+          <w:tcPr>
+            <w:tcW w:type="dxa" w:w="2803"/>
+            <w:tcBorders>
+              <w:top w:val="none" w:color="FFFFFF" w:sz="0"/>
+              <w:left w:val="none" w:color="FFFFFF" w:sz="0"/>
+              <w:bottom w:val="single" w:color="C9D1D9" w:sz="4"/>
+              <w:right w:val="none" w:color="FFFFFF" w:sz="0"/>
+            </w:tcBorders>
+            <w:tcMar>
+              <w:top w:type="dxa" w:w="140"/>
+              <w:left w:type="dxa" w:w="80"/>
+              <w:bottom w:type="dxa" w:w="140"/>
+              <w:right w:type="dxa" w:w="80"/>
+            </w:tcMar>
+            <w:vAlign w:val="center"/>
+          </w:tcPr>
+          <w:p>
+            <w:r>
+              <w:rPr>
+                <w:rFonts w:ascii="Arial" w:cs="Arial" w:eastAsia="Arial" w:hAnsi="Arial"/>
+                <w:sz w:val="30"/>
+                <w:szCs w:val="30"/>
+              </w:rPr>
+              <w:t xml:space="preserve">yes      no</w:t>
+            </w:r>
+          </w:p>
+        </w:tc>
+        <w:tc>
+          <w:tcPr>
+            <w:tcW w:type="dxa" w:w="1950"/>
+            <w:tcBorders>
+              <w:top w:val="none" w:color="FFFFFF" w:sz="0"/>
+              <w:left w:val="none" w:color="FFFFFF" w:sz="0"/>
+              <w:bottom w:val="single" w:color="C9D1D9" w:sz="4"/>
+              <w:right w:val="none" w:color="FFFFFF" w:sz="0"/>
+            </w:tcBorders>
+            <w:tcMar>
+              <w:top w:type="dxa" w:w="140"/>
+              <w:left w:type="dxa" w:w="80"/>
+              <w:bottom w:type="dxa" w:w="140"/>
+              <w:right w:type="dxa" w:w="80"/>
+            </w:tcMar>
+            <w:vAlign w:val="center"/>
+          </w:tcPr>
+          <w:p>
+            <w:r>
+              <w:rPr>
+                <w:rFonts w:ascii="Arial" w:cs="Arial" w:eastAsia="Arial" w:hAnsi="Arial"/>
+                <w:b/>
+                <w:bCs/>
+                <w:color w:val="163B65"/>
+                <w:sz w:val="30"/>
+                <w:szCs w:val="30"/>
+              </w:rPr>
+              <w:t xml:space="preserve">Coins used</w:t>
+            </w:r>
+          </w:p>
+        </w:tc>
+        <w:tc>
+          <w:tcPr>
+            <w:tcW w:type="dxa" w:w="3003"/>
+            <w:tcBorders>
+              <w:top w:val="none" w:color="FFFFFF" w:sz="0"/>
+              <w:left w:val="none" w:color="FFFFFF" w:sz="0"/>
+              <w:bottom w:val="single" w:color="C9D1D9" w:sz="4"/>
+              <w:right w:val="none" w:color="FFFFFF" w:sz="0"/>
+            </w:tcBorders>
+            <w:tcMar>
+              <w:top w:type="dxa" w:w="140"/>
+              <w:left w:type="dxa" w:w="80"/>
+              <w:bottom w:type="dxa" w:w="140"/>
+              <w:right w:type="dxa" w:w="80"/>
+            </w:tcMar>
+            <w:vAlign w:val="center"/>
+          </w:tcPr>
+          <w:p>
+            <w:r>
+              <w:rPr>
+                <w:rFonts w:ascii="Arial" w:cs="Arial" w:eastAsia="Arial" w:hAnsi="Arial"/>
+                <w:sz w:val="30"/>
+                <w:szCs w:val="30"/>
+              </w:rPr>
+              <w:t xml:space="preserve">____ / 10</w:t>
             </w:r>
           </w:p>
         </w:tc>
@@ -635,7 +755,7 @@
           <w:sz w:val="22"/>
           <w:szCs w:val="22"/>
         </w:rPr>
-        <w:t xml:space="preserve">Circle one answer in each line.</w:t>
+        <w:t xml:space="preserve">Circle one answer in each line. You have 10 coins.</w:t>
       </w:r>
     </w:p>
     <w:tbl>

</xml_diff>